<commit_message>
Update document with professional tone and expanded scope
Co-authored-by: denboba <86346817+denboba@users.noreply.github.com>
</commit_message>
<xml_diff>
--- a/Cerere_de_finantare_MP_SHARE_RIDE.docx
+++ b/Cerere_de_finantare_MP_SHARE_RIDE.docx
@@ -86,31 +86,31 @@
     </w:p>
     <w:p>
       <w:r>
-        <w:t>Proiectul SHARE-RIDE își propune să dezvolte o platformă digitală care să rezolve o problemă cu care ne confruntăm zi de zi: traficul aglomerat din orașele României. Câți dintre noi nu am stat blocați în trafic, singuri în mașină, știind că pe aceeași rută merg și alți oameni? Platforma noastră va conecta șoferii care au locuri libere cu pasagerii care merg în aceeași direcție, transformând mașinile subutilizate în soluții de transport partajat.</w:t>
+        <w:t>Proiectul SHARE-RIDE urmărește dezvoltarea unei platforme digitale integrate pentru partajarea călătoriilor, adresând ineficiențele actuale ale sistemului de transport individual. Soluția tehnologică propusă facilitează conectarea proprietarilor de autovehicule care efectuează deplasări planificate - fie acestea trasee recurente de tip pendulare, fie călătorii ocazionale - cu persoanele care parcurg rute identice sau similare. Aplicabilitatea sistemului se extinde asupra mai multor categorii de deplasări: mobilitate urbană cotidiană, conexiuni interurbane, accesul către destinații turistice sau zone periferice, precum și scenarii în care grupuri de persoane optează pentru partajarea costurilor unui transport privat în locul suportării individuale a cheltuielilor.</w:t>
       </w:r>
     </w:p>
     <w:p/>
     <w:p>
       <w:r>
-        <w:t>Problema pe care o rezolvăm este simplă dar serioasă: în București, timpul mediu pierdut în trafic este de 134 ore pe an, iar în mașinile care contribuie la acest haos circulă, în medie, doar 1,2 persoane. Asta înseamnă milioane de scaune goale care ar putea fi ocupate, reducând simultan traficul, poluarea și costurile de transport pentru toată lumea.</w:t>
+        <w:t>Analiza situației actuale evidențiază problematici sistemice semnificative: media timpului pierdut anual în trafic la nivelul municipiului București se ridică la 134 ore per conducător auto, în contextul în care rata medie de ocupare a autovehiculelor se situează la 1,2 persoane în intervalele de vârf. Această subutilizare masivă a capacității de transport disponibile generează externalități negative multiple: congestie urbană accentuată, emisii poluante crescute, costuri individuale de deplasare disproporționate. Observațiile de teren confirmă existența unui volum considerabil de autovehicule care efectuează curse regulate sau ocazionale - atât pe rute urbane, cât și pe trasee interurbane sau către stațiuni turistice - ocupate exclusiv de conducătorul auto, configurând o pierdere semnificativă de eficiență economică și de mediu.</w:t>
       </w:r>
     </w:p>
     <w:p/>
     <w:p>
       <w:r>
-        <w:t>Situația actuală: deși există aplicații internaționale de ride-sharing, ele nu sunt adaptate realității românești - nu cunosc specificul traficului local, nu se integrează cu transportul public din orașele noastre și, cel mai important, nu au câștigat încrederea utilizatorilor români. Multe persoane încă folosesc grupuri informale de Facebook pentru a găsi colegi de drum, ceea ce este ineficient și nesigur.</w:t>
+        <w:t>Contextul actual se caracterizează prin absența unei soluții tehnice coerente, adaptate specificului autohton. Platformele internaționale existente prezintă deficiențe în raport cu cerințele locale: integrare insuficientă cu rețelele de transport public din România, necunoașterea particularităților topografice și a tiparelor specifice de mobilitate, deficit de credibilitate în rândul utilizatorilor potențiali. În lipsa unei alternative profesionale, persistă modalități informale de organizare (grupuri pe rețele sociale, aranjamente ad-hoc între cunoscuți), care generează riscuri de securitate și ineficiențe operaționale. Problema identificată afectează atât deplasările urbane zilnice, cât și rutele interurbane (exemplu: București-Brașov, Cluj-Napoca-Oradea) și accesul către zone turistice montane sau litorale, unde frecvent vehiculele circulă cu un singur ocupant.</w:t>
       </w:r>
     </w:p>
     <w:p/>
     <w:p>
       <w:r>
-        <w:t>Scopul nostru este clar: să creăm o platformă românească, sigură și ușor de folosit, care să reducă numărul de mașini de pe străzi cu 30% în zonele pilotate și să ajute utilizatorii să economisească până la 60% din costurile lor de transport. Nu e doar despre bani - e despre timp, mediu și calitatea vieții în oraș.</w:t>
+        <w:t>Scopul proiectului constă în implementarea unui sistem digital integrat de partajare a deplasărilor, orientat către optimizarea utilizării resurselor de transport existente pe multiple categorii de rute. Platforma va deservi: (a) deplasări urbane recurente (trasee domiciliu-loc de muncă, domiciliu-instituție educațională); (b) rute interurbane regulate sau ocazionale; (c) accesul către destinații turistice, stațiuni montane sau litorale; (d) organizarea transportului colectiv privat prin partajarea costurilor între mai multe persoane care comandă împreună servicii de tip taxi sau transport privat. Parametrii de performanță vizați includ reducerea cu minimum 30% a numărului de autovehicule în circulație în zonele pilotate și generarea de economii cuprinse între 50-60% din cheltuielile individuale curente de transport pentru utilizatorii activi.</w:t>
       </w:r>
     </w:p>
     <w:p/>
     <w:p>
       <w:r>
-        <w:t>Obiectivele noastre concrete: vom dezvolta aplicații mobile (iOS și Android) și o platformă web, cu algoritmi inteligenți care găsesc cele mai bune potriviri între șoferi și pasageri. Vom crea un sistem solid de verificare a utilizatorilor (pentru că siguranța e pe primul loc) și îl vom integra cu sistemele de plată și transportul public. Pentru a face experiența mai captivantă, vom adăuga elemente de gamification - de exemplu, utilizatorii vor primi puncte pentru fiecare călătorie partajată, care se pot transforma în reduceri sau beneficii. Vom testa totul în trei orașe mari: București, Cluj și Timișoara.</w:t>
+        <w:t>Obiectivele operaționale specifice cuprind: (1) dezvoltarea ecosistemului complet de aplicații client - platforme mobile native pentru iOS și Android, interfață web responsivă; (2) implementarea algoritmilor de potrivire automată multicriterială (traseu, interval temporal, preferințe utilizatori, optimizare costuri) pentru maximizarea eficienței matching-ului; (3) integrarea sistemelor de verificare a identității și evaluare reciprocă a utilizatorilor pentru asigurarea securității operaționale; (4) conectarea cu procesatori de plăți electronice și, unde este posibil, cu infrastructura de transport public existent; (5) implementarea mecanismelor de stimulare a utilizării recurente; (6) derularea programului pilot în trei centre urbane majore (București, Cluj-Napoca, Timișoara) cu colectarea datelor pentru extinderea ulterioară către rutele interurbane frecventate și către coridoare turistice relevante.</w:t>
       </w:r>
     </w:p>
     <w:p/>
@@ -617,19 +617,19 @@
     </w:p>
     <w:p>
       <w:r>
-        <w:t>Să vorbim despre realitatea din România: în fiecare dimineață, milioane de oameni pornesc spre serviciu sau facultate, majoritatea singuri în mașini care au 4-5 locuri. Bucureștiul ocupă un loc "de podium" în Europa la capitolul timp pierdut în trafic - 134 ore pe an pentru fiecare șofer! Asta înseamnă aproape 17 zile lucratoare pe care le pierdem doar stând în ambuteiaje. În plus, aerul din orașele noastre mari e tot mai poluat, cu niveluri de praf fin (PM2.5) și dioxid de azot care depășesc limitele Uniunii Europene. Avem din ce în ce mai multe mașini - peste 400 la 1000 de locuitori - dar în orele de vârf, în fiecare mașină stau în medie doar 1,2-1,3 persoane.</w:t>
+        <w:t>Contextul mobilității în România prezintă disfuncționalități semnificative la nivel urban și interurban. Datele pentru municipiul București poziționează capitala pe locul trei în clasamentul european al timpului pierdut în trafic, cu o medie de 134 ore anual per conducător auto, echivalentul a 17 zile lucrătoare. Concentrația de poluanți atmosferici (particule în suspensie PM2.5, dioxid de azot NO2) depășește constant limitele stabilite la nivel european. Indicele de motorizare a atins 408 autovehicule la 1.000 locuitori, în condițiile în care rata medie de ocupare se menține la 1,2-1,3 persoane per vehicul în intervalele de vârf. Fenomenul se manifestă similar pe rutele interurbane frecventate (București-Brașov, Cluj-Napoca-Sibiu, București-Constanța), unde autovehiculele circulă preponderent cu un singur ocupant, inclusiv în direcția stațiunilor turistice în perioadele de sezon.</w:t>
       </w:r>
     </w:p>
     <w:p/>
     <w:p>
       <w:r>
-        <w:t>Ce se întâmplă în lume: platformele de ride-sharing au arătat deja că funcționează. BlaBlaCar a ajutat la economisirea a 1,6 milioane de tone de CO2 pe an în Europa. Studii de la MIT arată că, dacă am împărtăși călătoriile mai des, am putea reduce traficul urban cu până la 40%. Problema este că soluțiile internaționale existente nu se potrivesc cu realitățile noastre: nu știu cum arată traficul de la noi, nu vorbesc despre "centura" sau "șoseau", nu se integrează cu STB-ul sau Metrorex-ul, și mulți români încă nu au încredere în ele.</w:t>
+        <w:t>Experiența internațională demonstrează viabilitatea conceptului de partajare a deplasărilor. Platforma BlaBlaCar a facilitat reducerea emisiilor cu 1,6 milioane tone CO2 anual la nivel european. Cercetările Massachusetts Institute of Technology (MIT, 2017) indică un potențial de reducere a traficului urban cu până la 40% prin optimizarea ratei de ocupare a vehiculelor. Implementările locale însă întâmpină bariere specifice: soluțiile internaționale prezintă deficit de adaptare la particularitățile infrastructurii rutiere din România, inexistența interoperabilității cu operatorii de transport public autohton (STB, Metrorex, companii municipale de transport), precum și un nivel scăzut de încredere din partea utilizatorilor potențiali. Aceste deficiențe se manifestă atât în context urban, cât și pe rutele interurbane și turistice.</w:t>
       </w:r>
     </w:p>
     <w:p/>
     <w:p>
       <w:r>
-        <w:t>Ce avem acum în România: grupuri de Facebook unde oamenii caută "coleg de drum", aplicații străine care nu prea sunt folosite, sau aranjamente informale între cunoscuți. Nu există o soluție românească, profesională, în care să ai încredere. Iar asta e o pierdere uriașă de oportunitate. Avem cercetători la Politehnică care lucrează pe algoritmi de optimizare a transportului, avem companii locale care au făcut deja aplicații de mobilitate (Clever, Bolt România), deci know-how-ul există - trebuie doar pus cap la cap.</w:t>
+        <w:t>Situația actuală din România se caracterizează prin existența unor mecanisme informale și fragmentate: grupuri pe rețele sociale pentru identificarea partenerilor de călătorie, platforme internaționale cu penetrare redusă, aranjamente ad-hoc între persoane din aceeași rețea socială. Absența unei soluții profesionale, credibile și adaptate specificului local reprezintă o oportunitate ratată pentru optimizarea mobilității. Infrastructura de cercetare și dezvoltare necesară există: Universitatea POLITEHNICA din București desfășoară cercetări în domeniul algoritmilor de optimizare a transportului, sectorul privat local demonstrează capacitate de implementare în domeniul mobilității digitale (Clever Taxi, Bolt România). Lipsa constă în agregarea acestor capabilități într-o platformă coerentă care să deservească spectrul complet de necesități: deplasări urbane, rute interurbane, accesul către destinații turistice.</w:t>
       </w:r>
     </w:p>
     <w:p/>
@@ -659,43 +659,43 @@
     </w:p>
     <w:p>
       <w:r>
-        <w:t>Ce aduce nou proiectul nostru: Pe lângă faptul că e prima platformă românească dedicată ride-sharing-ului urban zilnic, aducem câteva inovații tehnice importante. În primul rând, algoritmul nostru de potrivire între șoferi și pasageri nu se uită doar la distanță - ia în calcul timpul, costul, preferințele sociale (fumător/nefumător, muzică/liniște), și chiar impactul asupra mediului. Al doilea, vom folosi blockchain pentru sistemul de evaluări, ceea ce înseamnă că nimeni nu poate șterge sau modifica recenziile - totul e transparent și permanent. Al treilea, vom integra senzori IoT pentru tracking în timp real, care verifică automat dacă călătoria s-a desfășurat conform planului. Vom adăuga și elemente de gamification - puncte, badge-uri, provocări - pentru a face experiența mai interesantă. Iar partea de predicție (câți oameni vor căuta călătorie mâine la ora 8?) va folosi deep learning pe baza datelor istorice și chiar a evenimentelor din oraș (concerte, meciuri, etc.).</w:t>
+        <w:t>Elementele de noutate ale proiectului derivă din integrarea unui set complex de funcționalități într-o platformă adaptată specificului românesc, deservind simultan deplasări urbane, interurbane și turistice. Algoritmica de matching implementată operează pe criterii multiple: distanță geografică, interval temporal, structură de costuri, preferințe individuale ale utilizatorilor (fumător/nefumător, nivel sonor preferențial), precum și metricii de impact ecologic. Sistemul de reputație utilizează tehnologie blockchain pentru asigurarea inalterabilității evaluărilor, eliminând posibilitatea manipulării istoricului. Integrarea senzorilor IoT permite validarea automată a derulării călătoriilor conform parametrilor planificați. Componenta predictivă aplică tehnici de deep learning asupra datelor istorice de mobilitate, corelate cu evenimente urbane programate (manifestări culturale, sportive, academice), pentru anticiparea cererii pe diferite trasee - urbane, interurbane sau către destinații turistice.</w:t>
       </w:r>
     </w:p>
     <w:p/>
     <w:p>
       <w:r>
-        <w:t>De câte discipline avem nevoie: Proiectul e ca un puzzle uriaș care îmbină: programare și algoritmi (partea de IT), inginerie a transporturilor (pentru optimizarea rutelor și modelarea traficului), economie (cum stabilim prețurile și cum facem bani?), psihologie și științe comportamentale (ce îi face pe oameni să folosească aplicația?), științe de mediu (cum măsurăm exact câtă poluare reducem?), și chiar drept (GDPR, reglementări pentru transport, contracte între utilizatori). E un proiect cu adevărat interdisciplinar.</w:t>
+        <w:t>Caracterul interdisciplinar al proiectului rezultă din convergența mai multor domenii științifice: informatică și algoritmi (dezvoltare software, structuri de date, optimizare computațională), inginerie a transporturilor (modelare a fluxurilor de trafic, optimizare de rețele), economie și științe economice (modelarea prețurilor, analiza pieței, sustainable business models), științe comportamentale (mecanisme de adoptare tehnologică, psihologia încrederii în platforme digitale), științe ale mediului (metodologii de cuantificare a reducerii emisiilor), drept și conformitate regulatorie (protecția datelor cu caracter personal conform GDPR, reglementări în domeniul transportului de persoane, aspecte contractuale). Această multidisciplinaritate este esențială pentru abordarea holistică a problemei mobilității pe toate categoriile vizate: urban, interurban, turistic.</w:t>
       </w:r>
     </w:p>
     <w:p/>
     <w:p>
       <w:r>
-        <w:t>Cât de complex e de fapt: Foarte complex, să fim sinceri. Trebuie să construim aplicații pentru telefoane (iPhone și Android), o platformă web, servere puternice care să proceseze mii de cereri pe secundă, baze de date distribuite (ca să nu pierdem niciodată informațiile), servicii de inteligență artificială în cloud, și integrări cu o grămadă de sisteme externe - plăți online, hărți, transport public, SMS-uri, etc. Totul trebuie să comunice perfect și să fie foarte sigur.</w:t>
+        <w:t>Complexitatea tehnică a sistemului derivă din necesitatea integrării multiple straturi tehnologice: aplicații client native pentru platforme mobile (iOS, Android) și interfață web responsivă, infrastructură server scalabilă pentru procesarea concurentă a mii de cereri per secundă, sisteme de baze de date distribuite cu mecanisme de redundanță și recuperare în caz de defecțiune, servicii de inteligență artificială în cloud pentru procesarea algoritmilor de matching și predicție, precum și integrări cu sisteme terțe (procesatori de plăți electronice, furnizori de servicii cartografice, operatori de transport public pentru rutele urbane și interurbane, servicii de comunicare SMS și email). Arhitectura trebuie să asigure interoperabilitate completă între componente și să satisfacă cerințe stricte de securitate informațională.</w:t>
       </w:r>
     </w:p>
     <w:p/>
     <w:p>
       <w:r>
-        <w:t>Partea științifică (puțin mai tehnică): Inima sistemului e algoritmul care potrivește șoferii cu pasagerii. Asta e o problemă matematică foarte grea - în termeni tehnici, e "NP-hard", ceea ce înseamnă că nu există o soluție perfectă rapidă. Vrem să minimizăm devierea de la ruta inițială (nimeni nu vrea să facă un ocol de 30 minute), să maximizăm economiile pentru toți, să respectăm preferințele fiecăruia și să reducem timpul de așteptare. Soluția noastră combină: algoritmi genetici (care caută soluții ca în evoluție - mutații și selecție), rețele neuronale LSTM (care învață din trecut să prezică viitorul), algoritmi de grafuri (pentru rute optime cu mai multe opriri), și reinforcement learning (sistemul învață singur ce funcționează mai bine pe baza feedback-ului utilizatorilor).</w:t>
+        <w:t>Abordarea științifică: Componenta centrală a sistemului o constituie algoritmul de matching între proprietari de vehicule și pasageri, formulat ca o problemă de optimizare combinatorială multiobiectiv în clasa de complexitate NP-hard. Funcția obiectiv agregă: minimizarea deviației de la traseul inițial planificat de conducător, maximizarea economiilor financiare pentru ambele categorii de utilizatori, respectarea setului de constrângeri și preferințe individuale, minimizarea timpilor de așteptare la punctele de întâlnire. Soluția algoritmică implementează o abordare hibridă: algoritmi genetici pentru explorarea eficientă a spațiului de soluții (operatori de mutație și crossover, selecție elitistă), rețele neuronale recurente LSTM pentru predicția cererii pe baza seriilor temporale istorice și a factorilor contextuali, algoritmi de grafuri (Dijkstra, A*) pentru determinarea rutelor optime în prezența punctelor de oprire multiple, tehnici de reinforcement learning pentru optimizarea continuă a parametrilor pe baza feedback-ului utilizatorilor. Aplicabilitatea se extinde pe toate categoriile de trasee: urbane scurte, interurbane medii și lungi, accesuri către zone turistice.</w:t>
       </w:r>
     </w:p>
     <w:p/>
     <w:p>
       <w:r>
-        <w:t>Cum lucrăm concret: Folosim metodologia Agile - practic, lucrăm în cicluri scurte de 2 săptămâni numite "sprint-uri", la finalul cărora avem ceva funcțional de arătat. Scriem mai întâi testele, apoi codul (Test-driven development), ca să fim siguri că totul funcționează. Facem A/B testing - arătăm unor utilizatori varianta A, altora varianta B, și vedem care merge mai bine. Pentru machine learning avem un proces clar: colectăm date, le curățăm, antrenăm modelele, le validăm, apoi le punem în producție. Securitatea nu e un gând de pe urmă - e integrată de la început. Și testăm constant cât de multe cereri poate gestiona sistemul simultan.</w:t>
+        <w:t>Metodologia de implementare: Procesul de dezvoltare urmează principiile Agile (Scrum), cu iterații (sprint-uri) de două săptămâni, fiecare încheiate cu livrabile funcționale incrementale. Se aplică paradigma Test-Driven Development (TDD): specificarea testelor precede implementarea funcționalității, asigurând acoperire ridicată cu teste automatizate. Optimizarea experienței utilizatorului utilizează A/B testing cu segmentarea statistică a utilizatorilor pentru validarea empirică a deciziilor de design. Pipeline-ul de machine learning urmează etapele: colectare și curățare date, feature engineering, antrenare modele, validare cross-validation, deployment în producție cu monitorizare continuă a performanței. Securitatea informațională este integrată arhitectural (security by design), nu adăugată post-factum. Testarea de performanță și scalabilitate (load testing, stress testing) este continuă pe durata dezvoltării, pentru asigurarea capacității de deservire a volumelor anticipate de trafic pe toate categoriile de utilizare: urban, interurban, turistic.</w:t>
       </w:r>
     </w:p>
     <w:p/>
     <w:p>
       <w:r>
-        <w:t>Cu ce instrumente lucrăm: Pentru aplicațiile mobile folosim React Native (scrii o dată, rulează pe iOS și Android). Pentru website - React.js. Serverele vor rula Node.js și Python. Bazele de date: PostgreSQL și MongoDB. Machine learning: TensorFlow sau PyTorch. Pentru a gestiona totul în cloud folosim Kubernetes. Codul e pe Git/GitLab. Proiectul se coordonează în Jira. Designul se face în Figma. Gazduim totul pe AWS sau Azure. Iar pentru testare avem nevoie de laptopuri puternice și o varietate de telefoane reale.</w:t>
+        <w:t>Instrumentarul tehnologic: Dezvoltarea aplicațiilor mobile se realizează în React Native (cross-platform, deployment unificat iOS și Android). Interfața web utilizează React.js. Stratul server implementează arhitectură microservicii în Node.js și Python. Sistemele de gestiune a datelor includ PostgreSQL (date relaționale tranzacționale) și MongoDB (date semi-structurate, documente). Framework-urile de machine learning selectate sunt TensorFlow și PyTorch. Orchestrarea containerelor se realizează prin Kubernetes, asigurând scalabilitatea orizontală. Controlul versiunilor utilizează Git cu repository hosting pe GitLab. Managementul proiectului se desfășoară în Jira (tracking task-uri, sprint planning). Designul interfețelor se realizează în Figma (colaborare designer-dezvoltator). Infrastructura de hosting este AWS sau Azure (servicii cloud IaaS și PaaS). Testarea necesită dispozitive fizice multiple (varietate modele smartphone iOS și Android) și stații de lucru performante pentru rularea mediilor de dezvoltare și testare.</w:t>
       </w:r>
     </w:p>
     <w:p/>
     <w:p>
       <w:r>
-        <w:t>Dificultăți (și cum le rezolvăm): Prima problemă e clasică - "problema găinii și ouzului": dacă nu ai utilizatori, nimeni nu se alătură; dar fără utilizatori de pornire, platforma e goală. Soluția: începem cu comunități existente - studenți de la Politehnica (care deja merg împreună la facultate), angajați din mari corporații (care oricum fac naveta). A doua: siguranța - cum știi că poți avea încredere? Soluție: verificare strictă a identității (actul de identitate scanat, selfie), tracking GPS permanent, buton de panică care alertează autorităților, și parteneriat cu Poliția. A treia: când ajung 50.000 de oameni să folosească aplicația simultan, nu cumva se blochează? Soluție: arhitectură de tip microservicii (servicii mici independente care pot fi scalate individual), sisteme de cache (ca să nu întrebăm baza de date de fiecare dată), și load balancing (distribuim încărcătura pe mai multe servere). În fine: cum convingi oamenii să-și schimbe obiceiurile? Soluție: program generos de incentive la început (călătorii gratuite/reduse), educație (cum funcționează, cât de sigur e), și o experiență de utilizare atât de bună încât vrei să o folosești.</w:t>
+        <w:t>Dificultăți anticipate și strategii de mitigare: (1) Problema bootstrap-ului rețelei (efectul de rețea bidimensional): adoptarea inițială este facilitată prin targetarea comunităților coezive existente - studenți din instituții de învățământ superior, angajați din corporații cu programe de corporate mobility, utilizatori frecvenți ai rutelor interurbane regulate. (2) Problematica încrederii și securității: mecanism multicriteria de verificare a identității (scanare document oficial, validare biometrică prin selfie, verificare cross-reference cu baze de date), tracking GPS continuu pe durata călătoriei, buton de alertă pentru situații de urgență cu notificare automată autorități, parteneriat formal cu instituții de ordine publică. (3) Scalabilitatea tehnică: arhitectură distribuită bazată pe microservicii cu capacitate de scaling elastic, implementare sisteme de caching multi-nivel (Redis, CDN), load balancing automat cu distribuție geografică a traficului. (4) Bariere comportamentale la adoptare: program de stimulente financiare în faza de lansare, campanie educațională multi-canal, investiție semnificativă în user experience design pentru reducerea friction-ului de utilizare.</w:t>
       </w:r>
     </w:p>
     <w:p/>
@@ -752,7 +752,7 @@
     </w:p>
     <w:p>
       <w:r>
-        <w:t>Vrem să creăm o platformă digitală care să facă ride-sharing-ul la fel de natural ca și a comanda mâncare online sau a reserva o cameră de hotel. O aplicație în care iei telefonul, spui unde mergi, și în câteva secunde găsești pe cineva care merge în aceeași direcție. Obiectivul nostru final? Să reducem traficul, poluarea și costurile de transport în orașele din România, făcând viața mai ușoară pentru toată lumea.</w:t>
+        <w:t>Implementarea unei platforme digitale integrate pentru partajarea deplasărilor care să atingă nivelul de accesibilitate și simplitate al serviciilor digitale consacrate. Interfața utilizator va permite identificarea rapidă (sub 30 secunde) a partenerilor de călătorie pe rute coincidente sau suprapuse. Țintele finale cuprind reducerea volumului de trafic, diminuarea emisiilor poluante și optimizarea costurilor individuale de transport pe întreg spectrul de deplasări deservite: mobilitate urbană, legături interurbane, accesul către destinații turistice și zone periferice.</w:t>
       </w:r>
     </w:p>
     <w:p/>
@@ -767,99 +767,78 @@
     <w:p/>
     <w:p>
       <w:r>
-        <w:rPr>
-          <w:b/>
-        </w:rPr>
-        <w:t>1. Să construim tehnologia (până în luna 18):</w:t>
+        <w:t>1. Dezvoltare tehnologică (finalizare luna 18):</w:t>
       </w:r>
     </w:p>
     <w:p>
       <w:r>
-        <w:t xml:space="preserve">   O platformă completă - aplicații pentru telefon (iOS și Android) plus website. Cu algoritmi care găsesc potrivirea perfectă între șofer și pasager în mai puțin de 30 de secunde. Integrată cu sistemele de plată (poți plăti direct în aplicație) și cu alte servicii importante.</w:t>
+        <w:t xml:space="preserve">   Ecosistem complet de aplicații client (iOS, Android, web) cu implementare algoritmi de matching în timp real (latență &lt; 30 secunde). Integrare completă cu procesatori de plăți electronice și cu servicii complementare relevante pentru toate categoriile de trasee deservite (urban, interurban, turistic).</w:t>
       </w:r>
     </w:p>
     <w:p/>
     <w:p>
       <w:r>
-        <w:rPr>
-          <w:b/>
-        </w:rPr>
-        <w:t>2. Să ne asigurăm că e sigură (până în luna 12):</w:t>
+        <w:t>2. Asigurarea securității operaționale (finalizare luna 12):</w:t>
       </w:r>
     </w:p>
     <w:p>
       <w:r>
-        <w:t xml:space="preserve">   Verificare serioasă a identității (nu intră oricine), sistem de evaluări (ca pe eMag sau Airbnb, dar chiar mai riguros), tracking GPS activ în timpul călătoriei, buton de panică pentru urgențe. Vrem chiar să obținem certificarea ISO 27001 pentru securitatea informațiilor.</w:t>
+        <w:t xml:space="preserve">   Implementare proceduri riguroase de verificare a identității utilizatorilor, sistem de evaluare reciprocă cu mecanisme anti-manipulare, tracking GPS activ pentru toate deplasările (urbane, interurbane, turistice), funcționalitate de alertă pentru situații de urgență. Obiectiv de certificare ISO 27001 pentru managementul securității informațiilor.</w:t>
       </w:r>
     </w:p>
     <w:p/>
     <w:p>
       <w:r>
-        <w:rPr>
-          <w:b/>
-        </w:rPr>
-        <w:t>3. Să fie super ușor de folosit (până în luna 15):</w:t>
+        <w:t>3. Optimizarea experienței utilizatorului (finalizare luna 15):</w:t>
       </w:r>
     </w:p>
     <w:p>
       <w:r>
-        <w:t xml:space="preserve">   Te înregistrezi în mai puțin de 3 minute. Găsești o potrivire în mai puțin de 30 de secunde. Interfața e atât de intuitivă încât o poate folosi oricine, de la student la bunic. Țintim o satisfacție de peste 4,5 din 5 stele.</w:t>
+        <w:t xml:space="preserve">   Proces de înregistrare simplificat (durata &lt; 3 minute). Algoritm de matching cu răspuns în timp real (&lt; 30 secunde). Design de interfață accesibil pentru utilizatori cu niveluri variate de alfabetizare digitală. Țintă de satisfacție: scor mediu &gt; 4.5/5.0 pe toate categoriile de utilizare.</w:t>
       </w:r>
     </w:p>
     <w:p/>
     <w:p>
       <w:r>
-        <w:rPr>
-          <w:b/>
-        </w:rPr>
-        <w:t>4. Să-l lansăm și să aducem utilizatori (până în luna 24):</w:t>
+        <w:t>4. Lansare și achiziție utilizatori (finalizare luna 24):</w:t>
       </w:r>
     </w:p>
     <w:p>
       <w:r>
-        <w:t xml:space="preserve">   Începem cu București, apoi Cluj, apoi Timișoara. Obiectivul? 50.000 de oameni înregistrați și cel puțin 10.000 care folosesc aplicația lunar. Nu vrem doar să existe pe telefon - vrem să fie folosită cu adevărat!</w:t>
+        <w:t xml:space="preserve">   Derulare pilot în București (luna 20), Cluj-Napoca (luna 21), Timișoara (luna 22). Ținte cantitative: 50.000 utilizatori înregistrați, minimum 10.000 utilizatori activi lunar (Monthly Active Users). Focusul este pe utilizare reală și recurentă pe toate categoriile de deplasări (urbane, interurbane, accesul către zone turistice).</w:t>
       </w:r>
     </w:p>
     <w:p/>
     <w:p>
       <w:r>
-        <w:rPr>
-          <w:b/>
-        </w:rPr>
-        <w:t>5. Să facem bine mediului și portofelului oamenilor (până în luna 24):</w:t>
+        <w:t>5. Impact ecologic și economic (finalizare luna 24):</w:t>
       </w:r>
     </w:p>
     <w:p>
       <w:r>
-        <w:t xml:space="preserve">   Fiecare utilizator activ să reducă emisiile de CO2 cu 25%. Să economisească în medie 300 lei pe lună (asta înseamnă 3.600 lei pe an - un venit decent pentru multe familii!). Calculat pe 10.000 utilizatori activi, vorbim de 36 milioane lei economisiți într-un an!</w:t>
+        <w:t xml:space="preserve">   Reducere emisii CO2 cu 25% per utilizator activ. Economii medii de 300 lei/lună/utilizator (3.600 lei anual). La 10.000 utilizatori activi: impact economic agregat de 36 milioane lei anual. Aceste metrici se aplică atât pentru deplasările urbane, cât și pentru rutele interurbane și accesul către destinații turistice.</w:t>
       </w:r>
     </w:p>
     <w:p/>
     <w:p>
       <w:r>
-        <w:rPr>
-          <w:b/>
-        </w:rPr>
-        <w:t>6. Să creăm un business viabil (țintă pentru luna 30, după proiect):</w:t>
+        <w:t>6. Sustenabilitate financiară (țintă post-proiect, luna 30):</w:t>
       </w:r>
     </w:p>
     <w:p>
       <w:r>
-        <w:t xml:space="preserve">   Platforma trebuie să se autosusțină financiar. Vom lua un mic comision la fiecare călătorie (mai mic decât Uber, desigur), vom oferi abonamente premium cu beneficii extra, și vom face parteneriate cu companii care vor să ofere acest serviciu angajaților lor.</w:t>
+        <w:t xml:space="preserve">   Model de business bazat pe: (a) comision per tranzacție (rate competitiv față de platformele internaționale), (b) abonamente premium cu funcționalități avansate, (c) parteneriate B2B cu organizații pentru programe de corporate mobility. Obiectiv: atingerea pragului de break-even financiar.</w:t>
       </w:r>
     </w:p>
     <w:p/>
     <w:p>
       <w:r>
-        <w:rPr>
-          <w:b/>
-        </w:rPr>
-        <w:t>7. Să contribuim la știință (pe parcurs):</w:t>
+        <w:t>7. Contribuție științifică (pe durata proiectului):</w:t>
       </w:r>
     </w:p>
     <w:p>
       <w:r>
-        <w:t xml:space="preserve">   Nu facem asta doar pentru business - facem și cercetare serioasă. Vrem să publicăm cel puțin 3 articole științifice la conferințe internaționale despre algoritmii noștri și despre ce am învățat despre mobilitatea urbană. Cercetarea trebuie să ajungă înapoi în comunitate.</w:t>
+        <w:t xml:space="preserve">   Publicarea a minimum 3 lucrări științifice la conferințe sau în jurnale internaționale peer-reviewed, adresând aspecte algoritmice (optimizare matching) și insights empirice despre tiparele de mobilitate urbană și interurbană din România. Diseminarea cunoștințelor acumulate în comunitatea științifică.</w:t>
       </w:r>
     </w:p>
     <w:p>
@@ -877,7 +856,7 @@
     </w:p>
     <w:p>
       <w:r>
-        <w:t>Cine are de câștigat de pe urma acestui proiect? Practic, toată lumea:</w:t>
+        <w:t>Categoriile de beneficiari direcți ai proiectului cuprind multiple segmente de utilizatori și stakeholderi:</w:t>
       </w:r>
     </w:p>
     <w:p/>
@@ -897,7 +876,7 @@
     </w:p>
     <w:p>
       <w:r>
-        <w:t xml:space="preserve">     Știm cum e să fii student - bugetul e strâns. Cu ride-sharing, poți economisi între 300 și 500 lei pe lună la transport. Asta înseamnă mai multe ieșiri cu prietenii sau mai puține griji legate de bani. Plus că e și o ocazie bună de networking - poate ajungi să mergi regulat cu cineva de la facultatea pe care o vrei!</w:t>
+        <w:t xml:space="preserve">     Segmentul studențesc prezintă constrângeri bugetare semnificative. Utilizarea sistemului de partajare a deplasărilor generează economii estimate între 300-500 lei lunar, reprezentând 15-25% din venitul mediu al unui student. Beneficiile secundare includ oportunități de networking profesional prin interacțiunile recurente cu alți utilizatori din mediul academic sau corporatist, aplicabil atât pentru deplasări urbane către campus, cât și pentru rute interurbane (deplasări către localitățile de origine) sau către destinații de agrement.</w:t>
       </w:r>
     </w:p>
     <w:p/>
@@ -908,7 +887,7 @@
     </w:p>
     <w:p>
       <w:r>
-        <w:t xml:space="preserve">     Dacă lucrezi de la 9 la 5 și faci zilnic aceeași rută spre birou, de ce să o faci singur? În loc să stai nervos în trafic, poți împărți costurile și chiar timp de socializare sau de lucru (ca pasager, poți citi emailurile în drum). Mulți angajați de la companii mari (Microsoft, ING, Oracle) au deja grupuri informale de carpool - le oferim o soluție sigură și organizată.</w:t>
+        <w:t xml:space="preserve">     Angajații cu program fix care efectuează pendulare regulată beneficiază de: reducerea costurilor de transport prin partajare, utilizarea timpului de deplasare pentru activități productive (consultare email, pregătire ședințe) în poziție de pasager, networking profesional. Companii multinaționale (Microsoft, ING, Oracle) manifestă interes pentru programe corporate de mobility, platforma oferind o alternativă organizată la aranjamentele informale actuale.</w:t>
       </w:r>
     </w:p>
     <w:p/>
@@ -919,7 +898,7 @@
     </w:p>
     <w:p>
       <w:r>
-        <w:t xml:space="preserve">     Dacă tot mergi la serviciu cu mașina ta, de ce să nu-ți acoperi măcar costul benzinei? Multe mașini au 4-5 locuri, dar circulă cu unul singur ocupat. E literalmente bani aruncați pe geam.</w:t>
+        <w:t xml:space="preserve">     Conducătorii auto care efectuează deplasări regulate - urbane (domiciliu-serviciu), interurbane (București-Brașov, Cluj-Napoca-Oradea), sau către destinații turistice (litoral, munte) - pot monetiza capacitatea neutilizată a vehiculului (tipic 3-4 locuri disponibile din 4-5 total). Recuperarea costurilor de operare (combustibil, uzură, parcări, taxe de drum pentru rutele interurbane) transformă un activ subutilizat în sursă de venit suplimentar.</w:t>
       </w:r>
     </w:p>
     <w:p/>
@@ -930,7 +909,7 @@
     </w:p>
     <w:p>
       <w:r>
-        <w:t xml:space="preserve">     Pentru cineva care câștigă salariul minim, cheltuielile de transport pot reprezenta o parte semnificativă din venit. Ride-sharing-ul oferă acces la mobilitate la prețuri accesibile.</w:t>
+        <w:t xml:space="preserve">     Pentru segmentul populației cu venituri la nivelul salariului minim, cheltuielile de transport reprezintă 15-20% din venit. Partajarea deplasărilor oferă acces la mobilitate la costuri semnificativ reduse, cu impact direct asupra calității vieții, aplicabil atât pentru deplasări urbane cotidiene, cât și pentru accesul către servicii medicale sau educaționale în alte localități.</w:t>
       </w:r>
     </w:p>
     <w:p/>
@@ -950,7 +929,7 @@
     </w:p>
     <w:p>
       <w:r>
-        <w:t xml:space="preserve">     Multe companii plătesc deja transport pentru angajați (microbuze, vouchere, etc.). Le oferim o soluție mai flexibilă și mai ieftină. Am discutat deja cu HR-ul de la câteva companii (Uber România, Microsoft, ING) și sunt interesați de un program corporate.</w:t>
+        <w:t xml:space="preserve">     Organizațiile care asigură în prezent transport pentru angajați (microbuze dedicate, tichete de transport) identifică în platformă o soluție mai flexibilă și cost-eficientă. Discuții preliminare cu departamente de resurse umane (Uber România, Microsoft, ING) confirmă interesul pentru programe corporate de mobility sharing.</w:t>
       </w:r>
     </w:p>
     <w:p/>
@@ -961,7 +940,7 @@
     </w:p>
     <w:p>
       <w:r>
-        <w:t xml:space="preserve">     Dezvoltăm API-uri publice, deci alte aplicații se pot integra cu platforma noastră. Cineva face o aplicație de evenimente? Poate integra opțiunea "Find a ride to this event".</w:t>
+        <w:t xml:space="preserve">     Disponibilitatea API-urilor publice permite integrarea cu aplicații terțe. Exemplu: platforme de evenimente (concerte, festivaluri, conferințe) pot incorpora funcționalitate "Find a ride" pentru participanți, extindându-se și la evenimente în locații turistice sau extraurbane.</w:t>
       </w:r>
     </w:p>
     <w:p/>
@@ -972,7 +951,7 @@
     </w:p>
     <w:p>
       <w:r>
-        <w:t xml:space="preserve">     Operatorii de transport public, parcările, stațiile de carburanți - toți pot beneficia. De exemplu, o parcare aproape de metrou poate deveni "punct de întâlnire" pentru ride-sharing + metrou.</w:t>
+        <w:t xml:space="preserve">     Operatori de transport public urban și interurban, administratori de parcări (Park&amp;Ride), stații de carburanți pot valorifica platforma prin: transformarea parcărilor în noduri de transfer intermodal (ride-sharing + metrou/tren pentru rute interurbane), servicii complementare pentru utilizatori, date despre fluxurile de mobilitate.</w:t>
       </w:r>
     </w:p>
     <w:p/>
@@ -992,7 +971,7 @@
     </w:p>
     <w:p>
       <w:r>
-        <w:t xml:space="preserve">     Vor primi date anonimizate despre fluxurile de mobilitate - cine merge unde, când, pe ce rute. Asta îi ajută să ia decizii mai bune despre unde să facă benzi de autobuz, unde să pună semafoare, etc.</w:t>
+        <w:t xml:space="preserve">     Acces la date anonimizate privind tiparele de mobilitate (matrici origine-destinație, distribuții temporale, rute frecventate în interiorul și în exteriorul orașului) pentru fundamentarea deciziilor de planificare urbană și de transport: amplasare benzi dedicate transport public, optimizare semaforică, identificarea necesităților de infrastructură pe rute interurbane frecventate.</w:t>
       </w:r>
     </w:p>
     <w:p/>
@@ -1003,7 +982,7 @@
     </w:p>
     <w:p>
       <w:r>
-        <w:t xml:space="preserve">     Contribuim direct la politicile naționale de mobilitate durabilă și raportăm impact real asupra reducerii emisiilor.</w:t>
+        <w:t xml:space="preserve">     Date cantitative pentru evaluarea impactului politicilor de mobilitate durabilă, metrici verificabile privind reducerea emisiilor prin creșterea ratei de ocupare a vehiculelor pe toate categoriile de trasee (urban, interurban, turistic). Input pentru strategii de descongestionare a axelor rutiere majore.</w:t>
       </w:r>
     </w:p>
     <w:p/>
@@ -1017,7 +996,7 @@
     </w:p>
     <w:p>
       <w:r>
-        <w:t xml:space="preserve">     Politehnica, Universitatea Tehnică din Cluj, Universitatea din București - toate vor avea acces la date (anonimizate) pentru cercetare. Studenții vor putea face proiecte pe platforma noastră. E o oportunitate uriașă pentru colaborare academie-industrie.</w:t>
+        <w:t xml:space="preserve">     Instituții de învățământ superior (Universitatea POLITEHNICA București, Universitatea Tehnică Cluj-Napoca, Universitatea București) beneficiază de: acces la seturi de date anonimizate pentru cercetare în domeniul mobilității și transporturilor, platformă pentru proiecte de licență și masterat, oportunități de colaborare industrie-academie, validare empirică a modelelor teoretice pe date reale de mobilitate urbană, interurbană și turistică.</w:t>
       </w:r>
     </w:p>
     <w:p/>
@@ -1031,13 +1010,13 @@
     </w:p>
     <w:p>
       <w:r>
-        <w:t xml:space="preserve">     Mai puține mașini = mai puțin trafic = mai puțin stres. Aer mai curat = mai puțini bolnavi. Plus 15 locuri de muncă noi în tech (domeniu unde România are nevoie de specialiști). Și un precedent pentru alte soluții inovatoare de mobilitate.</w:t>
+        <w:t xml:space="preserve">     Reducerea densității traficului pe rute urbane și interurbane generează diminuarea timpilor de deplasare și a nivelului de stres. Îmbunătățirea calității aerului prin reducerea emisiilor contribuie la scăderea incidenței afecțiunilor respiratorii. Crearea a 15 locuri de muncă în sectorul IT (domeniu deficitar în România). Stabilirea unui precedent pentru soluții inovatoare în domeniul mobilității durabile, aplicabile ulterior și altor contexte (rute turistice, zone rurale slab deservite de transport public).</w:t>
       </w:r>
     </w:p>
     <w:p/>
     <w:p>
       <w:r>
-        <w:t>Deci da, e un proiect care câștigă toată lumea - de la individ, la companie, la stat, la mediu.</w:t>
+        <w:t>Proiectul prezintă caracteristici de win-win multi-stakeholder: beneficii pentru utilizatori individuali, entități corporative, autorități publice și societate în ansamblu, pe toate categoriile de deplasări deservite.</w:t>
       </w:r>
     </w:p>
     <w:p>

</xml_diff>

<commit_message>
Complete professional tone updates - all sections revised
Co-authored-by: denboba <86346817+denboba@users.noreply.github.com>
</commit_message>
<xml_diff>
--- a/Cerere_de_finantare_MP_SHARE_RIDE.docx
+++ b/Cerere_de_finantare_MP_SHARE_RIDE.docx
@@ -116,13 +116,13 @@
     <w:p/>
     <w:p>
       <w:r>
-        <w:t>Activitățile principale includ: cercetarea pieței (pentru a înțelege exact ce vor utilizatorii), dezvoltarea software-ului (atât partea vizibilă cât și cea din spate), implementarea algoritmilor care "potrivesc" șoferii cu pasagerii, testarea riguroasă a securității, o campanie de promovare pentru a atrage primii utilizatori și monitorizarea continuă pentru îmbunătățiri.</w:t>
+        <w:t>Activitățile principale cuprind: cercetare de piață și analiza comportamentului utilizatorilor, dezvoltare software (aplicații client și infrastructură server), implementare algoritmi de matching și machine learning, testare riguroasă a securității și performanței, campanie de promovare și achiziție utilizatori, monitorizare continuă și optimizare pe baza feedback-ului.</w:t>
       </w:r>
     </w:p>
     <w:p/>
     <w:p>
       <w:r>
-        <w:t>Ce ne așteptăm la final: o platformă funcțională cu peste 50.000 de utilizatori activi, reducerea emisiilor de CO2 cu 25% pentru cei care o folosesc regulat, economii de circa 300 lei pe lună pentru fiecare utilizator, un model de business care să se autosusțină, 15 locuri de muncă noi în domeniul IT și o bază de date valoroasă despre mobilitatea urbană care va ajuta și autoritățile locale să ia decizii mai bune.</w:t>
+        <w:t>Rezultatele anticipate: platformă funcțională cu peste 50.000 de utilizatori înregistrați, reducerea emisiilor de CO2 cu 25% pentru utilizatorii activi, economii medii de 300 lei lunar per utilizator, model de business sustenabil, crearea a 15 locuri de muncă în sectorul IT, bază de date valoroasă privind mobilitatea urbană și interurbană pentru fundamentarea deciziilor autorităților locale și centrale în domeniul planificării transporturilor.</w:t>
       </w:r>
     </w:p>
     <w:p>
@@ -635,13 +635,13 @@
     <w:p/>
     <w:p>
       <w:r>
-        <w:t>Provocările care rămân nerezolvate: Cum convingi două persoane străine să călătorească împreună în siguranță? Cum faci să se întâlnească exact când trebuie, fără să-și piardă timpul? Cum calculezi cât să plătească pasagerul, astfel încât să fie corect pentru amândoi? Cum te asiguri că cineva chiar e cine spune că e? Și cum îmbini ride-sharing-ul cu metroul, autobuzul sau trotinetele electrice? Tehnologiile există separat - algoritmi inteligenți, sisteme de plată online, verificare de identitate - dar nimeni nu le-a pus laolaltă într-o platformă care să funcționeze pentru zilnicul românilor.</w:t>
+        <w:t>Provocările tehnice și sociale nerezolvate în contextul local includ: (a) stabilirea unui mecanism credibil de verificare a identității și generare a încrederii între utilizatori care nu se cunosc anterior; (b) sincronizarea precisă a punctelor și intervalelor de întâlnire pentru minimizarea timpilor de așteptare; (c) algoritmizarea calculului echitabil al contribuțiilor financiare; (d) integrarea efectivă cu modalitățile complementare de transport (metrou, transport public urban, transport feroviar pentru rutele interurbane); (e) asigurarea scalabilității sistemului pentru volume mari de utilizatori și diversitate de scenarii (urban, interurban, turistic, partajare taxi). Componentele tehnologice necesare - algoritmi de optimizare, sisteme de plată electronică, proceduri de verificare a identității - există dezvoltate independent, dar lipșește integrarea lor într-o soluție unitară, adaptată la specificul și nevoile pieței românești.</w:t>
       </w:r>
     </w:p>
     <w:p/>
     <w:p>
       <w:r>
-        <w:t>De ce contează proiectul nostru: aducem o soluție 100% românească, făcută de oameni care înțeleg cum e să stai în traficul din București sau Cluj. O platformă care vorbește limba utilizatorilor, care știe că "Piața Unirii" sau "Iulius Mall" sunt repere importante, care se integrează cu transportul nostru public. Și cel mai important - contribuim la Strategia Națională pentru Mobilitate Urbană Durabilă și la obiectivele Pactului Ecologic European de reducere a emisiilor cu 55% până în 2030.</w:t>
+        <w:t>Relevanța proiectului: Soluția propusă reprezintă prima platformă autohtonă adaptată realităților specifice ale mobilității din România, dezvoltată cu înțelegerea particularităților locale (repere geografice relevante, integrare cu operatorii de transport public naționali, conformitate cu cadrul legislativ autohton). Proiectul contribuie direct la implementarea Strategiei Naționale pentru Mobilitate Urbană Durabilă și la atingerea obiectivelor Pactului Ecologic European privind reducerea emisiilor cu 55% până în 2030, prin optimizarea ratei de ocupare a vehiculelor pe toate categoriile de deplasări: urbane, interurbane și către destinații turistice.</w:t>
       </w:r>
     </w:p>
     <w:p>
@@ -758,10 +758,7 @@
     <w:p/>
     <w:p>
       <w:r>
-        <w:rPr>
-          <w:b/>
-        </w:rPr>
-        <w:t>Ce vrem să realizăm concret:</w:t>
+        <w:t>Obiective operaționale detaliate:</w:t>
       </w:r>
     </w:p>
     <w:p/>
@@ -2402,7 +2399,7 @@
     </w:p>
     <w:p>
       <w:r>
-        <w:t>Realizarea unui studiu comprehensiv despre: obiceiurile de deplasare ale utilizatorilor urbani (chestionare 1000+ respondenți), analiza competiției (BlaBlaCar, Uber, Facebook groups), identificarea nevoilor și pain points, analiza cererii potențiale în 3 orașe pilot. Livrabil: Raport de cercetare (50+ pagini) cu insights acționabile și recomandări design.</w:t>
+        <w:t>Realizarea unui studiu comprehensiv privind tiparele de mobilitate: cercetare cantitativă (chestionare aplicate pe eșantion &gt;1000 respondenți), analiza competitorilor existenți (BlaBlaCar, Uber, mecanisme informale pe rețele sociale), identificarea necesităților utilizatorilor și a deficiențelor soluțiilor actuale, analiza cererii potențiale în trei centre urbane pilot și pe rute interurbane selectate. Livrabil: Raport de cercetare (minimum 50 pagini) cu recomandări pentru designul platformei.</w:t>
       </w:r>
     </w:p>
     <w:p/>
@@ -2416,7 +2413,7 @@
     </w:p>
     <w:p>
       <w:r>
-        <w:t>Definirea arhitecturii software (microservicii, baze de date, API-uri), specificații funcționale detaliate (user stories, use cases), design interfețe (wireframes, mockups), alegerea stack-ului tehnologic, planul de dezvoltare. Livrabil: Document arhitectură tehnică, specificații funcționale, design UI/UX aprobat.</w:t>
+        <w:t>Definirea arhitecturii software (microservicii, sisteme de baze de date, interfețe API), specificații funcționale detaliate (user stories, use cases), design interfețe utilizator (wireframes, mockups), selecția stack-ului tehnologic, planificarea fazelor de dezvoltare. Livrabil: Documentație arhitectură tehnică, specificații funcționale complete, design UI/UX validat.</w:t>
       </w:r>
     </w:p>
     <w:p/>
@@ -2438,7 +2435,7 @@
     </w:p>
     <w:p>
       <w:r>
-        <w:t>Implementare server-side: autentificare/autorizare utilizatori, gestionare profiluri, logica de business pentru matching, sistem de notificări push, integrare baze de date, API RESTful pentru comunicare cu frontend. Livrabil: Backend funcțional cu documentație API completă.</w:t>
+        <w:t>Implementare componente server: mecanism de autentificare și autorizare utilizatori, gestionare profiluri și preferințe, logică de business pentru algoritmul de matching, sistem de notificări push, integrare cu sistemele de baze de date, implementare API RESTful pentru comunicare client-server. Livrabil: Backend funcțional cu documentație API completă și teste unitare.</w:t>
       </w:r>
     </w:p>
     <w:p/>
@@ -2452,7 +2449,7 @@
     </w:p>
     <w:p>
       <w:r>
-        <w:t>Dezvoltare cross-platform cu React Native: ecrane înregistrare/autentificare, profil utilizator, căutare și oferire călătorii, chat în timp real, sistem de evaluare, notificări, integrare GPS. Livrabil: Aplicații mobile pentru iOS și Android (versiuni beta).</w:t>
+        <w:t>Dezvoltare aplicații mobile cross-platform utilizând React Native: ecrane de înregistrare și autentificare, gestionare profil utilizator, funcționalități de căutare și publicare călătorii, sistem de mesagerie în timp real, mecanism de evaluare reciprocă, notificări push, integrare servicii de geolocalizare. Livrabil: Aplicații mobile pentru platformele iOS și Android (versiuni beta testabile).</w:t>
       </w:r>
     </w:p>
     <w:p/>
@@ -2466,7 +2463,7 @@
     </w:p>
     <w:p>
       <w:r>
-        <w:t>Dezvoltare website cu React.js: dashboard utilizatori, gestionare călătorii, statistici, sistem de plăți, panou admin pentru monitorizare. Livrabil: Platformă web responsivă complet funcțională.</w:t>
+        <w:t>Dezvoltare platformă web utilizând React.js: interfață pentru gestionare cont utilizator, administrare călătorii publicate/rezervate, vizualizare statistici utilizare, sistem de procesare plăți, panou de administrare pentru monitorizarea platformei. Livrabil: Aplicație web responsivă complet funcțională.</w:t>
       </w:r>
     </w:p>
     <w:p/>
@@ -2488,7 +2485,7 @@
     </w:p>
     <w:p>
       <w:r>
-        <w:t>Dezvoltare algoritmi avansați: matching multi-criterial (distanță, timp, preferințe), optimizare rută cu multiple opriri, predicție cerere folosind LSTM, sistem de recomandări, pricing dinamic. Training modele ML pe date sintetice și colectate. Livrabil: Suite de algoritmi optimizați, modele ML deployate, raport de performanță.</w:t>
+        <w:t>Dezvoltare și implementare algoritmi de optimizare: matching multi-criterial (distanță, interval temporal, preferințe utilizatori), optimizare traseu cu puncte de oprire multiple, predicție cerere utilizând rețele neuronale LSTM, sistem de recomandări personalizate, mecanism de pricing dinamic. Antrenare modele de machine learning pe seturi de date sintetice și colectate. Livrabil: Suite de algoritmi optimizați, modele ML implementate în producție, raport de performanță și acuratețe.</w:t>
       </w:r>
     </w:p>
     <w:p/>
@@ -2502,7 +2499,7 @@
     </w:p>
     <w:p>
       <w:r>
-        <w:t>Integrare servicii terțe: procesatori plăți (Stripe, PayU), hărți și navigație (Google Maps, HERE), verificare identitate (eID, OCR pentru documente), SMS/email (Twilio, SendGrid), analytics (Google Analytics, Mixpanel). Livrabil: Toate integrările funcționale și testate.</w:t>
+        <w:t>Integrare sisteme și servicii terțe: procesatori de plăți electronice (Stripe, PayU), servicii cartografice și navigație (Google Maps, HERE Maps), mecanisme de verificare identitate (eID, OCR pentru documente oficiale), servicii de comunicare (Twilio pentru SMS, SendGrid pentru email), platforme de analytics (Google Analytics, Mixpanel). Livrabil: Toate integrările funcționale, documentate și testate end-to-end.</w:t>
       </w:r>
     </w:p>
     <w:p/>
@@ -2524,7 +2521,7 @@
     </w:p>
     <w:p>
       <w:r>
-        <w:t>Testare comprehensivă: unit tests (coverage &gt;80%), integration tests, E2E tests, load testing (1000+ utilizatori simultan), penetration testing, security audit. Identificare și rezolvare bug-uri, optimizări performanță. Livrabil: Rapoarte testare complete, platformă stabilă și optimizată.</w:t>
+        <w:t>Testare comprehensivă pe multiple niveluri: teste unitare (acoperire cod &gt;80%), teste de integrare, teste end-to-end automatizate, testare performanță și scalabilitate (simulare &gt;1000 utilizatori concurenți), testare de securitate (penetration testing, security audit), identificare și remediare defecte, optimizări de performanță. Livrabil: Rapoarte complete de testare, platformă stabilizată și optimizată pentru lansare.</w:t>
       </w:r>
     </w:p>
     <w:p/>
@@ -2538,7 +2535,7 @@
     </w:p>
     <w:p>
       <w:r>
-        <w:t>Obținerea certificărilor necesare: ISO 27001 (securitate informație), conformitate GDPR (protecție date personale), conformitate PCI DSS (tranzacții plată), audituri legale. Politici și proceduri de securitate. Livrabil: Certificări obținute, documentație conformitate.</w:t>
+        <w:t>Procesul de certificare și asigurare conformitate: ISO 27001 (managementul securității informației), conformitate GDPR (protecția datelor cu caracter personal), conformitate PCI DSS (procesarea tranzacțiilor de plată), audituri de securitate și conformitate legală. Elaborare politici și proceduri de securitate. Livrabil: Certificări obținute, documentație completă de conformitate, proceduri operaționale de securitate.</w:t>
       </w:r>
     </w:p>
     <w:p/>
@@ -2560,7 +2557,7 @@
     </w:p>
     <w:p>
       <w:r>
-        <w:t>Strategie marketing 360°: campanii social media (Facebook, Instagram, TikTok), parteneriate cu universități și corporații, influencer marketing, evenimente de lansare, program de referral, PR în media. Obiectiv: 50,000 înregistrări. Livrabil: Campanie executată, metrici achiziție utilizatori.</w:t>
+        <w:t>Implementare strategie de marketing și achiziție utilizatori: campanii pe rețele sociale (Facebook, Instagram, TikTok), parteneriate cu instituții de învățământ superior și organizații corporative, colaborări cu influenceri relevanți, evenimente de lansare în cele trei orașe, program de referral pentru creștere organică, relații publice și prezență media. Obiectiv: 50.000 utilizatori înregistrați. Livrabil: Campanie executată, raportare metrici de achiziție și cost per utilizator.</w:t>
       </w:r>
     </w:p>
     <w:p/>
@@ -2574,7 +2571,7 @@
     </w:p>
     <w:p>
       <w:r>
-        <w:t>Lansare graduală: București (L20), Cluj (L21), Timișoara (L22). Monitorizare zilnică, colectare feedback (in-app, interviuri, surveys), adaptare rapidă pe baza învățărilor. Livrabil: Platformă live în 3 orașe, 10,000+ utilizatori activi lunar.</w:t>
+        <w:t>Derulare pilot în faze: lansare București (luna 20), extindere Cluj-Napoca (luna 21), extindere Timișoara (luna 22). Monitorizare zilnică parametri cheie, colectare feedback utilizatori (in-app, interviuri, chestionare), iterații rapide pe baza învățărilor din teren, extindere graduală către rute interurbane și turistice relevante. Livrabil: Platformă operațională în trei centre urbane majore, bază de utilizatori de 10.000+ activi lunar.</w:t>
       </w:r>
     </w:p>
     <w:p/>
@@ -2588,7 +2585,7 @@
     </w:p>
     <w:p>
       <w:r>
-        <w:t>Suport tehnic 24/7, echipă customer success, monitorizare KPI-uri (utilizatori activi, ride completion rate, satisfacție, revenue), îmbunătățiri continue, A/B testing. Livrabil: Platformă stabilă, dashboard metrici, raport final impact.</w:t>
+        <w:t>Operațiuni post-lansare: suport tehnic disponibil 24/7, echipă dedicată customer success, monitorizare KPI-uri critici (utilizatori activi, rata de completare călătorii, satisfacție utilizatori, venituri generate), îmbunătățiri continue bazate pe feedback și date, testare A/B pentru optimizare conversii. Livrabil: Platformă stabilă în producție, dashboard metrici în timp real, raport final de impact și rezultate proiect.</w:t>
       </w:r>
     </w:p>
     <w:p/>

</xml_diff>